<commit_message>
Organize Lab 1 and update requirements
</commit_message>
<xml_diff>
--- a/Lab 1/Requirements_Table.docx
+++ b/Lab 1/Requirements_Table.docx
@@ -56,8 +56,6 @@
       <w:pPr>
         <w:spacing w:after="160"/>
       </w:pPr>
-      <w:bookmarkStart w:id="0" w:name="_GoBack"/>
-      <w:bookmarkEnd w:id="0"/>
       <w:r>
         <w:rPr>
           <w:rFonts w:ascii="Calibri" w:hAnsi="Calibri" w:eastAsia="Calibri" w:cs="Calibri"/>
@@ -140,7 +138,18 @@
                 <w:sz w:val="20"/>
                 <w:szCs w:val="20"/>
               </w:rPr>
-              <w:t xml:space="preserve"> ID</w:t>
+              <w:t xml:space="preserve"> </w:t>
+            </w:r>
+            <w:r>
+              <w:rPr>
+                <w:rFonts w:ascii="Calibri" w:hAnsi="Calibri" w:eastAsia="Calibri" w:cs="Calibri"/>
+                <w:b/>
+                <w:bCs/>
+                <w:sz w:val="20"/>
+                <w:szCs w:val="20"/>
+                <w:lang w:val="en-US" w:eastAsia="zh-CN"/>
+              </w:rPr>
+              <w:t>Req ID</w:t>
             </w:r>
           </w:p>
         </w:tc>
@@ -1737,7 +1746,7 @@
   <w:docDefaults>
     <w:rPrDefault>
       <w:rPr>
-        <w:rFonts w:asciiTheme="minorHAnsi" w:hAnsiTheme="minorHAnsi" w:eastAsiaTheme="minorEastAsia" w:cstheme="minorBidi"/>
+        <w:rFonts w:ascii="Times New Roman" w:hAnsi="Times New Roman" w:eastAsia="SimSun" w:cs="Times New Roman"/>
       </w:rPr>
     </w:rPrDefault>
     <w:pPrDefault/>

</xml_diff>